<commit_message>
completed, fix bugs and bring divergencce down from 2
</commit_message>
<xml_diff>
--- a/Navier-Stokes documentation.docx
+++ b/Navier-Stokes documentation.docx
@@ -2243,21 +2243,7 @@
         <w:rPr>
           <w:lang w:val="en-GB"/>
         </w:rPr>
-        <w:t xml:space="preserve">Boundary conditions are made to control how the simulation interacts with the domain around it, for example, in an aerodynamic wind tunnel simulation, the front is treated as an entry point for airflow, and the back an exit point, however, the rest of the walls are treated a </w:t>
-      </w:r>
-      <w:proofErr w:type="gramStart"/>
-      <w:r>
-        <w:rPr>
-          <w:lang w:val="en-GB"/>
-        </w:rPr>
-        <w:t>solid walls</w:t>
-      </w:r>
-      <w:proofErr w:type="gramEnd"/>
-      <w:r>
-        <w:rPr>
-          <w:lang w:val="en-GB"/>
-        </w:rPr>
-        <w:t>.</w:t>
+        <w:t>Boundary conditions are made to control how the simulation interacts with the domain around it, for example, in an aerodynamic wind tunnel simulation, the front is treated as an entry point for airflow, and the back an exit point, however, the rest of the walls are treated a solid walls.</w:t>
       </w:r>
     </w:p>
     <w:p>

</xml_diff>